<commit_message>
Finalizacion y correciones nuevamente
se cambia PF-26  A PF-27 y pruebas pendientes a realizar
http://localhost:8080/index.html
</commit_message>
<xml_diff>
--- a/pf27-vivero/evidencias/Evidencias_Tarea12_GersonLopezEnriquez.docx
+++ b/pf27-vivero/evidencias/Evidencias_Tarea12_GersonLopezEnriquez.docx
@@ -402,9 +402,12 @@
           <w:rPr>
             <w:rStyle w:val="Hipervnculo"/>
           </w:rPr>
-          <w:t>https://github.com/gersonezelopez-dev/Arquitectura-por-capas-semana-13-biblioteca-api</w:t>
+          <w:t>https://github.com/gersonezelopez-dev/PF27-Ventas-Inventario-Vivero</w:t>
         </w:r>
       </w:hyperlink>
+      <w:r>
+        <w:t xml:space="preserve"> </w:t>
+      </w:r>
       <w:r>
         <w:t xml:space="preserve"> </w:t>
       </w:r>
@@ -463,6 +466,7 @@
       <w:r>
         <w:rPr>
           <w:b/>
+          <w:noProof/>
         </w:rPr>
         <w:drawing>
           <wp:anchor distT="0" distB="0" distL="114300" distR="114300" simplePos="0" relativeHeight="251660288" behindDoc="0" locked="0" layoutInCell="1" allowOverlap="1" wp14:anchorId="653EABD5" wp14:editId="578EEF2E">
@@ -523,6 +527,7 @@
       <w:r>
         <w:rPr>
           <w:b/>
+          <w:noProof/>
         </w:rPr>
         <w:drawing>
           <wp:inline distT="0" distB="0" distL="0" distR="0" wp14:anchorId="17A0287B" wp14:editId="5E40B61C">
@@ -600,6 +605,7 @@
       <w:r>
         <w:rPr>
           <w:b/>
+          <w:noProof/>
         </w:rPr>
         <w:drawing>
           <wp:inline distT="0" distB="0" distL="0" distR="0" wp14:anchorId="35523D9A" wp14:editId="49675082">
@@ -651,6 +657,7 @@
       <w:r>
         <w:rPr>
           <w:b/>
+          <w:noProof/>
         </w:rPr>
         <w:lastRenderedPageBreak/>
         <w:drawing>
@@ -722,6 +729,7 @@
       <w:r>
         <w:rPr>
           <w:b/>
+          <w:noProof/>
         </w:rPr>
         <w:drawing>
           <wp:inline distT="0" distB="0" distL="0" distR="0" wp14:anchorId="22009CA4" wp14:editId="52FBAE47">
@@ -772,6 +780,7 @@
       <w:r>
         <w:rPr>
           <w:b/>
+          <w:noProof/>
         </w:rPr>
         <w:drawing>
           <wp:inline distT="0" distB="0" distL="0" distR="0" wp14:anchorId="0B563780" wp14:editId="7F2051D9">
@@ -822,6 +831,7 @@
       <w:r>
         <w:rPr>
           <w:b/>
+          <w:noProof/>
         </w:rPr>
         <w:drawing>
           <wp:inline distT="0" distB="0" distL="0" distR="0" wp14:anchorId="49DC1DD1" wp14:editId="3F6B0C7B">
@@ -872,6 +882,7 @@
       <w:r>
         <w:rPr>
           <w:b/>
+          <w:noProof/>
         </w:rPr>
         <w:drawing>
           <wp:inline distT="0" distB="0" distL="0" distR="0" wp14:anchorId="626A48CD" wp14:editId="2277DE21">
@@ -973,6 +984,7 @@
       <w:r>
         <w:rPr>
           <w:b/>
+          <w:noProof/>
         </w:rPr>
         <w:drawing>
           <wp:inline distT="0" distB="0" distL="0" distR="0" wp14:anchorId="5FEE62C4" wp14:editId="6F89C71C">
@@ -1023,6 +1035,7 @@
       <w:r>
         <w:rPr>
           <w:b/>
+          <w:noProof/>
         </w:rPr>
         <w:drawing>
           <wp:inline distT="0" distB="0" distL="0" distR="0" wp14:anchorId="7320F44A" wp14:editId="2BA8FC89">
@@ -1093,6 +1106,7 @@
       <w:r>
         <w:rPr>
           <w:b/>
+          <w:noProof/>
         </w:rPr>
         <w:drawing>
           <wp:inline distT="0" distB="0" distL="0" distR="0" wp14:anchorId="5ADF08A6" wp14:editId="1B03AF8F">
@@ -1184,6 +1198,7 @@
       <w:r>
         <w:rPr>
           <w:b/>
+          <w:noProof/>
         </w:rPr>
         <w:drawing>
           <wp:inline distT="0" distB="0" distL="0" distR="0" wp14:anchorId="356F16F4" wp14:editId="01D04C9C">
@@ -1234,6 +1249,7 @@
       <w:r>
         <w:rPr>
           <w:b/>
+          <w:noProof/>
         </w:rPr>
         <w:drawing>
           <wp:inline distT="0" distB="0" distL="0" distR="0" wp14:anchorId="2F17B877" wp14:editId="3C0C8520">
@@ -1284,6 +1300,7 @@
       <w:r>
         <w:rPr>
           <w:b/>
+          <w:noProof/>
         </w:rPr>
         <w:drawing>
           <wp:inline distT="0" distB="0" distL="0" distR="0" wp14:anchorId="475BE994" wp14:editId="2C1C9B26">
@@ -1460,16 +1477,8 @@
         <w:rPr>
           <w:b/>
         </w:rPr>
-        <w:t xml:space="preserve">Prueba </w:t>
-      </w:r>
-      <w:proofErr w:type="spellStart"/>
-      <w:r>
-        <w:rPr>
-          <w:b/>
-        </w:rPr>
-        <w:t>created</w:t>
-      </w:r>
-      <w:proofErr w:type="spellEnd"/>
+        <w:t>Prueba created</w:t>
+      </w:r>
     </w:p>
     <w:p>
       <w:pPr>
@@ -1481,6 +1490,9 @@
         </w:rPr>
       </w:pPr>
       <w:r>
+        <w:rPr>
+          <w:noProof/>
+        </w:rPr>
         <w:drawing>
           <wp:inline distT="0" distB="0" distL="0" distR="0" wp14:anchorId="67ED9AC2" wp14:editId="3F02B3F0">
             <wp:extent cx="5612130" cy="2561590"/>
@@ -1550,6 +1562,7 @@
       <w:r>
         <w:rPr>
           <w:b/>
+          <w:noProof/>
         </w:rPr>
         <w:drawing>
           <wp:inline distT="0" distB="0" distL="0" distR="0" wp14:anchorId="1D6FC63B" wp14:editId="6C93D19D">
@@ -1620,6 +1633,7 @@
       <w:r>
         <w:rPr>
           <w:b/>
+          <w:noProof/>
         </w:rPr>
         <w:lastRenderedPageBreak/>
         <w:drawing>
@@ -1691,6 +1705,7 @@
       <w:r>
         <w:rPr>
           <w:b/>
+          <w:noProof/>
         </w:rPr>
         <w:drawing>
           <wp:inline distT="0" distB="0" distL="0" distR="0" wp14:anchorId="7C2CAE2A" wp14:editId="28E3208C">
@@ -1761,6 +1776,7 @@
       <w:r>
         <w:rPr>
           <w:b/>
+          <w:noProof/>
         </w:rPr>
         <w:lastRenderedPageBreak/>
         <w:drawing>
@@ -1832,6 +1848,7 @@
       <w:r>
         <w:rPr>
           <w:b/>
+          <w:noProof/>
         </w:rPr>
         <w:drawing>
           <wp:inline distT="0" distB="0" distL="0" distR="0" wp14:anchorId="6ABA76CB" wp14:editId="43599801">
@@ -1923,6 +1940,7 @@
       <w:r>
         <w:rPr>
           <w:b/>
+          <w:noProof/>
         </w:rPr>
         <w:drawing>
           <wp:inline distT="0" distB="0" distL="0" distR="0" wp14:anchorId="784D0587" wp14:editId="349C74F5">
@@ -2214,31 +2232,7 @@
           <w:szCs w:val="24"/>
           <w:lang w:eastAsia="es-GT"/>
         </w:rPr>
-        <w:t xml:space="preserve">5. ¿Qué diferencia existe entre 400 Bad </w:t>
-      </w:r>
-      <w:proofErr w:type="spellStart"/>
-      <w:r>
-        <w:rPr>
-          <w:rFonts w:ascii="Times New Roman" w:hAnsi="Times New Roman" w:cs="Times New Roman"/>
-          <w:b/>
-          <w:bCs/>
-          <w:sz w:val="24"/>
-          <w:szCs w:val="24"/>
-          <w:lang w:eastAsia="es-GT"/>
-        </w:rPr>
-        <w:t>Request</w:t>
-      </w:r>
-      <w:proofErr w:type="spellEnd"/>
-      <w:r>
-        <w:rPr>
-          <w:rFonts w:ascii="Times New Roman" w:hAnsi="Times New Roman" w:cs="Times New Roman"/>
-          <w:b/>
-          <w:bCs/>
-          <w:sz w:val="24"/>
-          <w:szCs w:val="24"/>
-          <w:lang w:eastAsia="es-GT"/>
-        </w:rPr>
-        <w:t xml:space="preserve"> y 404 Not Found?</w:t>
+        <w:t>5. ¿Qué diferencia existe entre 400 Bad Request y 404 Not Found?</w:t>
       </w:r>
     </w:p>
     <w:p>
@@ -2333,47 +2327,7 @@
           <w:szCs w:val="24"/>
           <w:lang w:eastAsia="es-GT"/>
         </w:rPr>
-        <w:t xml:space="preserve">Durante el desarrollo de esta tarea aprendí la importancia de organizar una aplicación mediante una arquitectura por capas, utilizando </w:t>
-      </w:r>
-      <w:proofErr w:type="spellStart"/>
-      <w:r>
-        <w:rPr>
-          <w:rFonts w:ascii="Times New Roman" w:hAnsi="Times New Roman" w:cs="Times New Roman"/>
-          <w:sz w:val="24"/>
-          <w:szCs w:val="24"/>
-          <w:lang w:eastAsia="es-GT"/>
-        </w:rPr>
-        <w:t>Controller</w:t>
-      </w:r>
-      <w:proofErr w:type="spellEnd"/>
-      <w:r>
-        <w:rPr>
-          <w:rFonts w:ascii="Times New Roman" w:hAnsi="Times New Roman" w:cs="Times New Roman"/>
-          <w:sz w:val="24"/>
-          <w:szCs w:val="24"/>
-          <w:lang w:eastAsia="es-GT"/>
-        </w:rPr>
-        <w:t xml:space="preserve">, Service y </w:t>
-      </w:r>
-      <w:proofErr w:type="spellStart"/>
-      <w:r>
-        <w:rPr>
-          <w:rFonts w:ascii="Times New Roman" w:hAnsi="Times New Roman" w:cs="Times New Roman"/>
-          <w:sz w:val="24"/>
-          <w:szCs w:val="24"/>
-          <w:lang w:eastAsia="es-GT"/>
-        </w:rPr>
-        <w:t>Repository</w:t>
-      </w:r>
-      <w:proofErr w:type="spellEnd"/>
-      <w:r>
-        <w:rPr>
-          <w:rFonts w:ascii="Times New Roman" w:hAnsi="Times New Roman" w:cs="Times New Roman"/>
-          <w:sz w:val="24"/>
-          <w:szCs w:val="24"/>
-          <w:lang w:eastAsia="es-GT"/>
-        </w:rPr>
-        <w:t>. También comprendí cómo implementar DTO para recibir información, aplicar validaciones mediante anotaciones y manejar errores con excepciones personalizadas.</w:t>
+        <w:t>Durante el desarrollo de esta tarea aprendí la importancia de organizar una aplicación mediante una arquitectura por capas, utilizando Controller, Service y Repository. También comprendí cómo implementar DTO para recibir información, aplicar validaciones mediante anotaciones y manejar errores con excepciones personalizadas.</w:t>
       </w:r>
     </w:p>
     <w:p>
@@ -6386,6 +6340,7 @@
   <w:style w:type="character" w:default="1" w:styleId="Fuentedeprrafopredeter">
     <w:name w:val="Default Paragraph Font"/>
     <w:uiPriority w:val="1"/>
+    <w:semiHidden/>
     <w:unhideWhenUsed/>
   </w:style>
   <w:style w:type="table" w:default="1" w:styleId="Tablanormal">

</xml_diff>